<commit_message>
Further sorted crime dataset to remove non-applicable entires
</commit_message>
<xml_diff>
--- a/Data Processing Record.docx
+++ b/Data Processing Record.docx
@@ -226,16 +226,37 @@
         <w:tab/>
       </w:r>
       <w:r>
+        <w:t>TY</w:t>
+      </w:r>
+      <w:r>
         <w:tab/>
         <w:t>Commit Date:</w:t>
       </w:r>
+      <w:r>
+        <w:t xml:space="preserve"> 10/20/2026</w:t>
+      </w:r>
     </w:p>
     <w:p>
       <w:r>
         <w:t>Description:</w:t>
       </w:r>
     </w:p>
-    <w:p/>
+    <w:p>
+      <w:r>
+        <w:t xml:space="preserve">Removed all rows pertaining to “crimes” deemed not-applicable or already-covered. Examples include Truancy and Fare Evasion, which would lead to schools and public transport locations being </w:t>
+      </w:r>
+      <w:proofErr w:type="gramStart"/>
+      <w:r>
+        <w:t>weighted</w:t>
+      </w:r>
+      <w:proofErr w:type="gramEnd"/>
+      <w:r>
+        <w:t xml:space="preserve"> </w:t>
+      </w:r>
+      <w:r>
+        <w:t xml:space="preserve">as more dangerous. Harbor Crimes and Aviation Crimes were removed for the same reason. Investigate Property, Death Investigation, and Sick Assist are examples of non-criminal records removed. </w:t>
+      </w:r>
+    </w:p>
     <w:p/>
     <w:p/>
     <w:sectPr>

</xml_diff>